<commit_message>
docs: corregir a catorce el número de tablas en la guía 2.4
Co-Authored-By: Claude Opus 5.5 <noreply@anthropic.com>
Claude-Session: https://claude.ai/code/session_019yAiQ6SJ8faHeryAa6w9Vi
</commit_message>
<xml_diff>
--- a/Fase 2/Evidencias Grupales/2.4_GuiaEstudiante_Fase 2_DesarrolloProyecto APT.docx
+++ b/Fase 2/Evidencias Grupales/2.4_GuiaEstudiante_Fase 2_DesarrolloProyecto APT.docx
@@ -644,7 +644,7 @@
                 <w:b w:val="0"/>
                 <w:sz w:val="21"/>
               </w:rPr>
-              <w:t>Durante la Fase 1 el equipo completó la definición del proyecto: el planteamiento del problema, los objetivos, el alcance delimitado en nueve épicas dimensionadas en cien puntos de función, el modelo de datos con su diccionario de trece tablas y el catálogo de casos de prueba funcionales y no funcionales. Todo quedó documentado en el repositorio público del proyecto.</w:t>
+              <w:t>Durante la Fase 1 el equipo completó la definición del proyecto: el planteamiento del problema, los objetivos, el alcance delimitado en nueve épicas dimensionadas en cien puntos de función, el modelo de datos con su diccionario de catorce tablas y el catálogo de casos de prueba funcionales y no funcionales. Todo quedó documentado en el repositorio público del proyecto.</w:t>
             </w:r>
           </w:p>
           <w:p>
@@ -2008,7 +2008,7 @@
                 <w:b w:val="0"/>
                 <w:sz w:val="17"/>
               </w:rPr>
-              <w:t>Trece tablas con diccionario, enumerados y reglas de integridad. Los casos que no pudieron confirmarse con la contraparte quedaron escritos como supuestos de diseño, con su justificación.</w:t>
+              <w:t>Catorce tablas con diccionario, enumerados y reglas de integridad. Los casos que no pudieron confirmarse con la contraparte quedaron escritos como supuestos de diseño, con su justificación.</w:t>
             </w:r>
           </w:p>
         </w:tc>

</xml_diff>